<commit_message>
fix(chem): L03 exit ticket uses a fresh value (independent of worksheet practice)
Co-Authored-By: Claude Opus 4.8 <noreply@anthropic.com>
</commit_message>
<xml_diff>
--- a/Publisher_Ready_Curriculum/02_Chemistry_East_Meadow_Refactor/01_Safety_and_Measurement/03_Significant_Figures_and_Scientific_Notation/Answer_Key.docx
+++ b/Publisher_Ready_Curriculum/02_Chemistry_East_Meadow_Refactor/01_Safety_and_Measurement/03_Significant_Figures_and_Scientific_Notation/Answer_Key.docx
@@ -512,13 +512,13 @@
           <w:b/>
           <w:bCs/>
         </w:rPr>
-        <w:t xml:space="preserve">6,420,000 = 6.42 × 10⁶.</w:t>
+        <w:t xml:space="preserve">48,500,000 = 4.85 × 10⁷.</w:t>
       </w:r>
       <w:r>
         <w:t xml:space="preserve"> </w:t>
       </w:r>
       <w:r>
-        <w:t xml:space="preserve">Move the decimal six places to the left. The coefficient (6.42) is between 1 and 10, and the exponent (6) is positive because the original number is greater than 1. Three significant figures.</w:t>
+        <w:t xml:space="preserve">Move the decimal seven places to the left. The coefficient (4.85) is between 1 and 10, and the exponent (7) is positive because the original number is greater than 1. Three significant figures.</w:t>
       </w:r>
     </w:p>
     <w:p>
@@ -557,7 +557,7 @@
         <w:t xml:space="preserve"> </w:t>
       </w:r>
       <w:r>
-        <w:t xml:space="preserve">(a) 1 point for the correct count (4); 1 bonus point for correctly categorizing all four digit-types. (b) 1 point for the correct coefficient; 1 point for the correct exponent including sign. (c) 1 point for the correct rounded value; partial credit (0.5) if the student rounds to 7.9 (rounding correctly but misidentifying which digit is the third sig fig). NYSSLS: HS-PS1-7 foundational.</w:t>
+        <w:t xml:space="preserve">(a) 1 point for the correct count (4); 1 bonus point for correctly categorizing all four digit-types. (b) 1 point for the correct coefficient (4.85); 1 point for the correct exponent including sign (10⁷). (c) 1 point for the correct rounded value; partial credit (0.5) if the student rounds to 7.9 (rounding correctly but misidentifying which digit is the third sig fig). NYSSLS: HS-PS1-7 foundational.</w:t>
       </w:r>
     </w:p>
     <w:bookmarkEnd w:id="11"/>

</xml_diff>